<commit_message>
Update README and Project Instructions document
</commit_message>
<xml_diff>
--- a/docs/Project Instructions.docx
+++ b/docs/Project Instructions.docx
@@ -385,35 +385,7 @@
         <w:rPr>
           <w:rFonts w:ascii="Aptos" w:hAnsi="Aptos"/>
         </w:rPr>
-        <w:t xml:space="preserve">Highlight fields that appear only in certain datasets (e.g., </w:t>
-      </w:r>
-      <w:proofErr w:type="spellStart"/>
-      <w:r>
-        <w:rPr>
-          <w:rFonts w:ascii="Aptos" w:hAnsi="Aptos"/>
-        </w:rPr>
-        <w:t>BarcodeIdentifier</w:t>
-      </w:r>
-      <w:proofErr w:type="spellEnd"/>
-      <w:r>
-        <w:rPr>
-          <w:rFonts w:ascii="Aptos" w:hAnsi="Aptos"/>
-        </w:rPr>
-        <w:t xml:space="preserve">, </w:t>
-      </w:r>
-      <w:proofErr w:type="spellStart"/>
-      <w:r>
-        <w:rPr>
-          <w:rFonts w:ascii="Aptos" w:hAnsi="Aptos"/>
-        </w:rPr>
-        <w:t>ServiceTypeID</w:t>
-      </w:r>
-      <w:proofErr w:type="spellEnd"/>
-      <w:r>
-        <w:rPr>
-          <w:rFonts w:ascii="Aptos" w:hAnsi="Aptos"/>
-        </w:rPr>
-        <w:t>, Congressional fields).</w:t>
+        <w:t>Highlight fields that appear only in certain datasets (e.g., BarcodeIdentifier, ServiceTypeID, Congressional fields).</w:t>
       </w:r>
     </w:p>
     <w:p>
@@ -922,7 +894,6 @@
                 <w14:ligatures w14:val="none"/>
               </w:rPr>
             </w:pPr>
-            <w:proofErr w:type="spellStart"/>
             <w:r>
               <w:rPr>
                 <w:rFonts w:ascii="Aptos" w:eastAsia="Times New Roman" w:hAnsi="Aptos" w:cs="Calibri"/>
@@ -932,7 +903,6 @@
               </w:rPr>
               <w:t>MailCode</w:t>
             </w:r>
-            <w:proofErr w:type="spellEnd"/>
           </w:p>
         </w:tc>
         <w:tc>
@@ -1034,7 +1004,6 @@
                 <w14:ligatures w14:val="none"/>
               </w:rPr>
             </w:pPr>
-            <w:proofErr w:type="spellStart"/>
             <w:r>
               <w:rPr>
                 <w:rFonts w:ascii="Aptos" w:eastAsia="Times New Roman" w:hAnsi="Aptos" w:cs="Calibri"/>
@@ -1044,7 +1013,6 @@
               </w:rPr>
               <w:t>DonorID</w:t>
             </w:r>
-            <w:proofErr w:type="spellEnd"/>
           </w:p>
         </w:tc>
         <w:tc>
@@ -1141,7 +1109,6 @@
                 <w14:ligatures w14:val="none"/>
               </w:rPr>
             </w:pPr>
-            <w:proofErr w:type="spellStart"/>
             <w:r>
               <w:rPr>
                 <w:rFonts w:ascii="Aptos" w:eastAsia="Times New Roman" w:hAnsi="Aptos" w:cs="Calibri"/>
@@ -1151,7 +1118,6 @@
               </w:rPr>
               <w:t>DeliveryPoint</w:t>
             </w:r>
-            <w:proofErr w:type="spellEnd"/>
           </w:p>
         </w:tc>
         <w:tc>
@@ -1314,47 +1280,7 @@
                 <w:kern w:val="0"/>
                 <w14:ligatures w14:val="none"/>
               </w:rPr>
-              <w:t>Name title (</w:t>
-            </w:r>
-            <w:proofErr w:type="spellStart"/>
-            <w:r>
-              <w:rPr>
-                <w:rFonts w:ascii="Aptos" w:eastAsia="Times New Roman" w:hAnsi="Aptos" w:cs="Calibri"/>
-                <w:color w:val="000000"/>
-                <w:kern w:val="0"/>
-                <w14:ligatures w14:val="none"/>
-              </w:rPr>
-              <w:t>Mr</w:t>
-            </w:r>
-            <w:proofErr w:type="spellEnd"/>
-            <w:r>
-              <w:rPr>
-                <w:rFonts w:ascii="Aptos" w:eastAsia="Times New Roman" w:hAnsi="Aptos" w:cs="Calibri"/>
-                <w:color w:val="000000"/>
-                <w:kern w:val="0"/>
-                <w14:ligatures w14:val="none"/>
-              </w:rPr>
-              <w:t xml:space="preserve">, </w:t>
-            </w:r>
-            <w:proofErr w:type="spellStart"/>
-            <w:r>
-              <w:rPr>
-                <w:rFonts w:ascii="Aptos" w:eastAsia="Times New Roman" w:hAnsi="Aptos" w:cs="Calibri"/>
-                <w:color w:val="000000"/>
-                <w:kern w:val="0"/>
-                <w14:ligatures w14:val="none"/>
-              </w:rPr>
-              <w:t>Ms</w:t>
-            </w:r>
-            <w:proofErr w:type="spellEnd"/>
-            <w:r>
-              <w:rPr>
-                <w:rFonts w:ascii="Aptos" w:eastAsia="Times New Roman" w:hAnsi="Aptos" w:cs="Calibri"/>
-                <w:color w:val="000000"/>
-                <w:kern w:val="0"/>
-                <w14:ligatures w14:val="none"/>
-              </w:rPr>
-              <w:t>, Dr, etc.)</w:t>
+              <w:t>Name title (Mr, Ms, Dr, etc.)</w:t>
             </w:r>
           </w:p>
         </w:tc>
@@ -1398,7 +1324,6 @@
                 <w14:ligatures w14:val="none"/>
               </w:rPr>
             </w:pPr>
-            <w:proofErr w:type="spellStart"/>
             <w:r>
               <w:rPr>
                 <w:rFonts w:ascii="Aptos" w:eastAsia="Times New Roman" w:hAnsi="Aptos" w:cs="Calibri"/>
@@ -1408,7 +1333,6 @@
               </w:rPr>
               <w:t>BarcodeIdentifier</w:t>
             </w:r>
-            <w:proofErr w:type="spellEnd"/>
           </w:p>
         </w:tc>
         <w:tc>
@@ -1615,7 +1539,6 @@
                 <w14:ligatures w14:val="none"/>
               </w:rPr>
             </w:pPr>
-            <w:proofErr w:type="spellStart"/>
             <w:r>
               <w:rPr>
                 <w:rFonts w:ascii="Aptos" w:eastAsia="Times New Roman" w:hAnsi="Aptos" w:cs="Calibri"/>
@@ -1625,7 +1548,6 @@
               </w:rPr>
               <w:t>ServiceTypeID</w:t>
             </w:r>
-            <w:proofErr w:type="spellEnd"/>
           </w:p>
         </w:tc>
         <w:tc>
@@ -1850,7 +1772,6 @@
                 <w14:ligatures w14:val="none"/>
               </w:rPr>
             </w:pPr>
-            <w:proofErr w:type="spellStart"/>
             <w:r>
               <w:rPr>
                 <w:rFonts w:ascii="Aptos" w:eastAsia="Times New Roman" w:hAnsi="Aptos" w:cs="Calibri"/>
@@ -1860,7 +1781,6 @@
               </w:rPr>
               <w:t>MailerID</w:t>
             </w:r>
-            <w:proofErr w:type="spellEnd"/>
           </w:p>
         </w:tc>
         <w:tc>
@@ -2085,7 +2005,6 @@
                 <w14:ligatures w14:val="none"/>
               </w:rPr>
             </w:pPr>
-            <w:proofErr w:type="spellStart"/>
             <w:r>
               <w:rPr>
                 <w:rFonts w:ascii="Aptos" w:eastAsia="Times New Roman" w:hAnsi="Aptos" w:cs="Calibri"/>
@@ -2095,7 +2014,6 @@
               </w:rPr>
               <w:t>SerialNumber</w:t>
             </w:r>
-            <w:proofErr w:type="spellEnd"/>
           </w:p>
         </w:tc>
         <w:tc>
@@ -2215,7 +2133,6 @@
                 <w14:ligatures w14:val="none"/>
               </w:rPr>
             </w:pPr>
-            <w:proofErr w:type="spellStart"/>
             <w:r>
               <w:rPr>
                 <w:rFonts w:ascii="Aptos" w:eastAsia="Times New Roman" w:hAnsi="Aptos" w:cs="Calibri"/>
@@ -2225,7 +2142,6 @@
               </w:rPr>
               <w:t>GreetingLine</w:t>
             </w:r>
-            <w:proofErr w:type="spellEnd"/>
           </w:p>
         </w:tc>
         <w:tc>
@@ -2322,7 +2238,6 @@
                 <w14:ligatures w14:val="none"/>
               </w:rPr>
             </w:pPr>
-            <w:proofErr w:type="spellStart"/>
             <w:r>
               <w:rPr>
                 <w:rFonts w:ascii="Aptos" w:eastAsia="Times New Roman" w:hAnsi="Aptos" w:cs="Calibri"/>
@@ -2332,7 +2247,6 @@
               </w:rPr>
               <w:t>CongressionalDistrict</w:t>
             </w:r>
-            <w:proofErr w:type="spellEnd"/>
           </w:p>
         </w:tc>
         <w:tc>
@@ -2969,7 +2883,6 @@
                 <w14:ligatures w14:val="none"/>
               </w:rPr>
             </w:pPr>
-            <w:proofErr w:type="spellStart"/>
             <w:r>
               <w:rPr>
                 <w:rFonts w:ascii="Aptos" w:eastAsia="Times New Roman" w:hAnsi="Aptos" w:cs="Calibri"/>
@@ -2979,7 +2892,6 @@
               </w:rPr>
               <w:t>CongressionalName</w:t>
             </w:r>
-            <w:proofErr w:type="spellEnd"/>
           </w:p>
         </w:tc>
         <w:tc>
@@ -4510,7 +4422,6 @@
                 <w14:ligatures w14:val="none"/>
               </w:rPr>
             </w:pPr>
-            <w:proofErr w:type="spellStart"/>
             <w:r>
               <w:rPr>
                 <w:rFonts w:ascii="Aptos" w:eastAsia="Times New Roman" w:hAnsi="Aptos" w:cs="Calibri"/>
@@ -4520,7 +4431,6 @@
               </w:rPr>
               <w:t>DonationAmount</w:t>
             </w:r>
-            <w:proofErr w:type="spellEnd"/>
           </w:p>
         </w:tc>
         <w:tc>
@@ -5067,14 +4977,12 @@
           <w:rFonts w:ascii="Aptos" w:hAnsi="Aptos"/>
         </w:rPr>
       </w:pPr>
-      <w:proofErr w:type="spellStart"/>
       <w:r>
         <w:rPr>
           <w:rFonts w:ascii="Aptos" w:hAnsi="Aptos"/>
         </w:rPr>
         <w:t>DonationAmount</w:t>
       </w:r>
-      <w:proofErr w:type="spellEnd"/>
     </w:p>
     <w:p>
       <w:pPr>
@@ -5087,14 +4995,12 @@
           <w:rFonts w:ascii="Aptos" w:hAnsi="Aptos"/>
         </w:rPr>
       </w:pPr>
-      <w:proofErr w:type="spellStart"/>
       <w:r>
         <w:rPr>
           <w:rFonts w:ascii="Aptos" w:hAnsi="Aptos"/>
         </w:rPr>
         <w:t>DeliveryPoint</w:t>
       </w:r>
-      <w:proofErr w:type="spellEnd"/>
     </w:p>
     <w:p>
       <w:pPr>
@@ -5107,14 +5013,12 @@
           <w:rFonts w:ascii="Aptos" w:hAnsi="Aptos"/>
         </w:rPr>
       </w:pPr>
-      <w:proofErr w:type="spellStart"/>
       <w:r>
         <w:rPr>
           <w:rFonts w:ascii="Aptos" w:hAnsi="Aptos"/>
         </w:rPr>
         <w:t>BarcodeIdentifier</w:t>
       </w:r>
-      <w:proofErr w:type="spellEnd"/>
     </w:p>
     <w:p>
       <w:pPr>
@@ -5127,14 +5031,12 @@
           <w:rFonts w:ascii="Aptos" w:hAnsi="Aptos"/>
         </w:rPr>
       </w:pPr>
-      <w:proofErr w:type="spellStart"/>
       <w:r>
         <w:rPr>
           <w:rFonts w:ascii="Aptos" w:hAnsi="Aptos"/>
         </w:rPr>
         <w:t>ServiceTypeID</w:t>
       </w:r>
-      <w:proofErr w:type="spellEnd"/>
     </w:p>
     <w:p>
       <w:pPr>
@@ -5147,14 +5049,12 @@
           <w:rFonts w:ascii="Aptos" w:hAnsi="Aptos"/>
         </w:rPr>
       </w:pPr>
-      <w:proofErr w:type="spellStart"/>
       <w:r>
         <w:rPr>
           <w:rFonts w:ascii="Aptos" w:hAnsi="Aptos"/>
         </w:rPr>
         <w:t>MailerID</w:t>
       </w:r>
-      <w:proofErr w:type="spellEnd"/>
     </w:p>
     <w:p>
       <w:pPr>
@@ -5167,14 +5067,12 @@
           <w:rFonts w:ascii="Aptos" w:hAnsi="Aptos"/>
         </w:rPr>
       </w:pPr>
-      <w:proofErr w:type="spellStart"/>
       <w:r>
         <w:rPr>
           <w:rFonts w:ascii="Aptos" w:hAnsi="Aptos"/>
         </w:rPr>
         <w:t>SerialNumber</w:t>
       </w:r>
-      <w:proofErr w:type="spellEnd"/>
     </w:p>
     <w:p>
       <w:pPr>
@@ -5286,21 +5184,7 @@
         <w:rPr>
           <w:rFonts w:ascii="Aptos" w:hAnsi="Aptos"/>
         </w:rPr>
-        <w:t xml:space="preserve">Construct </w:t>
-      </w:r>
-      <w:proofErr w:type="spellStart"/>
-      <w:r>
-        <w:rPr>
-          <w:rFonts w:ascii="Aptos" w:hAnsi="Aptos"/>
-        </w:rPr>
-        <w:t>GreetingLine</w:t>
-      </w:r>
-      <w:proofErr w:type="spellEnd"/>
-      <w:r>
-        <w:rPr>
-          <w:rFonts w:ascii="Aptos" w:hAnsi="Aptos"/>
-        </w:rPr>
-        <w:t xml:space="preserve"> when missing (e.g., "Dear FirstName LastName")</w:t>
+        <w:t>Construct GreetingLine when missing (e.g., "Dear FirstName LastName")</w:t>
       </w:r>
       <w:r>
         <w:rPr>
@@ -5384,7 +5268,6 @@
         </w:rPr>
         <w:t xml:space="preserve"> will be used to address the recipient as 'Dear Friend' within </w:t>
       </w:r>
-      <w:proofErr w:type="spellStart"/>
       <w:r>
         <w:rPr>
           <w:rFonts w:ascii="Aptos" w:eastAsia="Times New Roman" w:hAnsi="Aptos" w:cs="Calibri"/>
@@ -5396,7 +5279,6 @@
         </w:rPr>
         <w:t>GreetingLine</w:t>
       </w:r>
-      <w:proofErr w:type="spellEnd"/>
       <w:r>
         <w:rPr>
           <w:rFonts w:ascii="Aptos" w:hAnsi="Aptos"/>
@@ -5625,7 +5507,6 @@
                 <w:szCs w:val="23"/>
               </w:rPr>
             </w:pPr>
-            <w:proofErr w:type="spellStart"/>
             <w:r>
               <w:rPr>
                 <w:rFonts w:ascii="Aptos" w:hAnsi="Aptos"/>
@@ -5634,7 +5515,6 @@
               </w:rPr>
               <w:t>BarcodeIdentifier</w:t>
             </w:r>
-            <w:proofErr w:type="spellEnd"/>
           </w:p>
         </w:tc>
         <w:tc>
@@ -5727,7 +5607,6 @@
                 <w:szCs w:val="23"/>
               </w:rPr>
             </w:pPr>
-            <w:proofErr w:type="spellStart"/>
             <w:r>
               <w:rPr>
                 <w:rFonts w:ascii="Aptos" w:hAnsi="Aptos"/>
@@ -5737,7 +5616,6 @@
               <w:lastRenderedPageBreak/>
               <w:t>ServiceTypeID</w:t>
             </w:r>
-            <w:proofErr w:type="spellEnd"/>
           </w:p>
         </w:tc>
         <w:tc>
@@ -5779,7 +5657,6 @@
                 <w:szCs w:val="23"/>
               </w:rPr>
             </w:pPr>
-            <w:proofErr w:type="spellStart"/>
             <w:r>
               <w:rPr>
                 <w:rFonts w:ascii="Aptos" w:hAnsi="Aptos"/>
@@ -5788,7 +5665,6 @@
               </w:rPr>
               <w:t>DeliveryPoint</w:t>
             </w:r>
-            <w:proofErr w:type="spellEnd"/>
           </w:p>
         </w:tc>
         <w:tc>
@@ -5832,7 +5708,6 @@
                 <w:szCs w:val="23"/>
               </w:rPr>
             </w:pPr>
-            <w:proofErr w:type="spellStart"/>
             <w:r>
               <w:rPr>
                 <w:rFonts w:ascii="Aptos" w:hAnsi="Aptos"/>
@@ -5841,7 +5716,6 @@
               </w:rPr>
               <w:t>MailerID</w:t>
             </w:r>
-            <w:proofErr w:type="spellEnd"/>
           </w:p>
         </w:tc>
         <w:tc>
@@ -5918,7 +5792,6 @@
                 <w:szCs w:val="23"/>
               </w:rPr>
             </w:pPr>
-            <w:proofErr w:type="spellStart"/>
             <w:r>
               <w:rPr>
                 <w:rFonts w:ascii="Aptos" w:hAnsi="Aptos"/>
@@ -5927,7 +5800,6 @@
               </w:rPr>
               <w:t>SerialNumber</w:t>
             </w:r>
-            <w:proofErr w:type="spellEnd"/>
           </w:p>
         </w:tc>
         <w:tc>
@@ -6158,14 +6030,12 @@
           <w:rFonts w:ascii="Aptos" w:hAnsi="Aptos"/>
         </w:rPr>
       </w:pPr>
-      <w:proofErr w:type="spellStart"/>
       <w:r>
         <w:rPr>
           <w:rFonts w:ascii="Aptos" w:hAnsi="Aptos"/>
         </w:rPr>
         <w:t>CongressionalDistrict</w:t>
       </w:r>
-      <w:proofErr w:type="spellEnd"/>
     </w:p>
     <w:p>
       <w:pPr>
@@ -6178,14 +6048,12 @@
           <w:rFonts w:ascii="Aptos" w:hAnsi="Aptos"/>
         </w:rPr>
       </w:pPr>
-      <w:proofErr w:type="spellStart"/>
       <w:r>
         <w:rPr>
           <w:rFonts w:ascii="Aptos" w:hAnsi="Aptos"/>
         </w:rPr>
         <w:t>CongressionalName</w:t>
       </w:r>
-      <w:proofErr w:type="spellEnd"/>
     </w:p>
     <w:p>
       <w:pPr>
@@ -6279,14 +6147,12 @@
         </w:rPr>
         <w:t xml:space="preserve">Deduplicate records using </w:t>
       </w:r>
-      <w:proofErr w:type="spellStart"/>
       <w:r>
         <w:rPr>
           <w:rFonts w:ascii="Aptos" w:hAnsi="Aptos"/>
         </w:rPr>
         <w:t>DonorID</w:t>
       </w:r>
-      <w:proofErr w:type="spellEnd"/>
       <w:r>
         <w:rPr>
           <w:rFonts w:ascii="Aptos" w:hAnsi="Aptos"/>
@@ -6434,21 +6300,7 @@
         <w:rPr>
           <w:rFonts w:ascii="Aptos" w:hAnsi="Aptos" w:cs="Segoe UI Symbol"/>
         </w:rPr>
-        <w:t xml:space="preserve"> step using </w:t>
-      </w:r>
-      <w:proofErr w:type="spellStart"/>
-      <w:r>
-        <w:rPr>
-          <w:rFonts w:ascii="Aptos" w:hAnsi="Aptos" w:cs="Segoe UI Symbol"/>
-        </w:rPr>
-        <w:t>sql</w:t>
-      </w:r>
-      <w:proofErr w:type="spellEnd"/>
-      <w:r>
-        <w:rPr>
-          <w:rFonts w:ascii="Aptos" w:hAnsi="Aptos" w:cs="Segoe UI Symbol"/>
-        </w:rPr>
-        <w:t xml:space="preserve"> queries.</w:t>
+        <w:t xml:space="preserve"> step using sql queries.</w:t>
       </w:r>
     </w:p>
     <w:p>
@@ -7133,6 +6985,12 @@
         </w:rPr>
         <w:t>: Data manipulation</w:t>
       </w:r>
+      <w:r>
+        <w:rPr>
+          <w:rFonts w:ascii="Aptos" w:hAnsi="Aptos"/>
+        </w:rPr>
+        <w:t>.</w:t>
+      </w:r>
     </w:p>
     <w:p>
       <w:pPr>
@@ -7145,7 +7003,6 @@
           <w:rFonts w:ascii="Aptos" w:hAnsi="Aptos"/>
         </w:rPr>
       </w:pPr>
-      <w:proofErr w:type="spellStart"/>
       <w:r>
         <w:rPr>
           <w:rFonts w:ascii="Aptos" w:hAnsi="Aptos"/>
@@ -7154,7 +7011,6 @@
         </w:rPr>
         <w:t>numpy</w:t>
       </w:r>
-      <w:proofErr w:type="spellEnd"/>
       <w:r>
         <w:rPr>
           <w:rFonts w:ascii="Aptos" w:hAnsi="Aptos"/>
@@ -7166,6 +7022,12 @@
           <w:rFonts w:ascii="Aptos" w:hAnsi="Aptos"/>
         </w:rPr>
         <w:t>numerical computing</w:t>
+      </w:r>
+      <w:r>
+        <w:rPr>
+          <w:rFonts w:ascii="Aptos" w:hAnsi="Aptos"/>
+        </w:rPr>
+        <w:t>.</w:t>
       </w:r>
     </w:p>
     <w:p>
@@ -7204,6 +7066,12 @@
           <w:rFonts w:ascii="Aptos" w:hAnsi="Aptos"/>
         </w:rPr>
         <w:t>alidation and cleansing</w:t>
+      </w:r>
+      <w:r>
+        <w:rPr>
+          <w:rFonts w:ascii="Aptos" w:hAnsi="Aptos"/>
+        </w:rPr>
+        <w:t>.</w:t>
       </w:r>
     </w:p>
     <w:p>
@@ -7215,23 +7083,13 @@
         </w:numPr>
         <w:spacing w:line="240" w:lineRule="auto"/>
       </w:pPr>
-      <w:proofErr w:type="spellStart"/>
-      <w:r>
-        <w:rPr>
-          <w:rFonts w:ascii="Aptos" w:hAnsi="Aptos"/>
-          <w:b/>
-          <w:bCs/>
-        </w:rPr>
-        <w:t>sqlalchemy</w:t>
-      </w:r>
-      <w:proofErr w:type="spellEnd"/>
-      <w:r>
-        <w:rPr>
-          <w:rFonts w:ascii="Aptos" w:hAnsi="Aptos"/>
-          <w:b/>
-          <w:bCs/>
-        </w:rPr>
-        <w:t>:</w:t>
+      <w:r>
+        <w:rPr>
+          <w:rFonts w:ascii="Aptos" w:hAnsi="Aptos"/>
+          <w:b/>
+          <w:bCs/>
+        </w:rPr>
+        <w:t>sqlalchemy:</w:t>
       </w:r>
       <w:r>
         <w:t xml:space="preserve"> </w:t>
@@ -7293,27 +7151,19 @@
           <w:b/>
           <w:bCs/>
         </w:rPr>
-        <w:t>Docker</w:t>
-      </w:r>
-      <w:r>
-        <w:rPr>
-          <w:rFonts w:ascii="Aptos" w:hAnsi="Aptos"/>
-        </w:rPr>
-        <w:t xml:space="preserve">: Containerization platform to package the ETL pipeline, dependencies, runtime environment, </w:t>
-      </w:r>
-      <w:r>
-        <w:rPr>
-          <w:rFonts w:ascii="Aptos" w:hAnsi="Aptos"/>
-          <w:b/>
-          <w:bCs/>
-        </w:rPr>
-        <w:t>and SQL Server</w:t>
-      </w:r>
-      <w:r>
-        <w:rPr>
-          <w:rFonts w:ascii="Aptos" w:hAnsi="Aptos"/>
-        </w:rPr>
-        <w:t xml:space="preserve"> into containers for consistent deployment and testing across systems</w:t>
+        <w:t>Azure Data Studio</w:t>
+      </w:r>
+      <w:r>
+        <w:rPr>
+          <w:rFonts w:ascii="Aptos" w:hAnsi="Aptos"/>
+        </w:rPr>
+        <w:t>: Cross-platform database management and development tool for querying, managing, and visualizing SQL Server data</w:t>
+      </w:r>
+      <w:r>
+        <w:rPr>
+          <w:rFonts w:ascii="Aptos" w:hAnsi="Aptos"/>
+        </w:rPr>
+        <w:t>.</w:t>
       </w:r>
     </w:p>
     <w:p>
@@ -7333,13 +7183,33 @@
           <w:b/>
           <w:bCs/>
         </w:rPr>
-        <w:t>Dashboard / Visualization:</w:t>
-      </w:r>
-      <w:r>
-        <w:rPr>
-          <w:rFonts w:ascii="Aptos" w:hAnsi="Aptos"/>
-        </w:rPr>
-        <w:t xml:space="preserve"> Power BI for interactive analytics and visualizations.</w:t>
+        <w:t>Docker</w:t>
+      </w:r>
+      <w:r>
+        <w:rPr>
+          <w:rFonts w:ascii="Aptos" w:hAnsi="Aptos"/>
+        </w:rPr>
+        <w:t xml:space="preserve">: Containerization platform to package the ETL pipeline, dependencies, runtime environment, </w:t>
+      </w:r>
+      <w:r>
+        <w:rPr>
+          <w:rFonts w:ascii="Aptos" w:hAnsi="Aptos"/>
+          <w:b/>
+          <w:bCs/>
+        </w:rPr>
+        <w:t>and SQL Server</w:t>
+      </w:r>
+      <w:r>
+        <w:rPr>
+          <w:rFonts w:ascii="Aptos" w:hAnsi="Aptos"/>
+        </w:rPr>
+        <w:t xml:space="preserve"> into containers for consistent deployment and testing across systems</w:t>
+      </w:r>
+      <w:r>
+        <w:rPr>
+          <w:rFonts w:ascii="Aptos" w:hAnsi="Aptos"/>
+        </w:rPr>
+        <w:t>.</w:t>
       </w:r>
     </w:p>
     <w:p>
@@ -7351,21 +7221,47 @@
         <w:spacing w:line="259" w:lineRule="auto"/>
         <w:rPr>
           <w:rFonts w:ascii="Aptos" w:hAnsi="Aptos"/>
-          <w:b/>
-          <w:bCs/>
-        </w:rPr>
-      </w:pPr>
-      <w:r>
-        <w:rPr>
-          <w:rFonts w:ascii="Aptos" w:hAnsi="Aptos"/>
-          <w:b/>
-          <w:bCs/>
-        </w:rPr>
-        <w:t>Business Customer Connect (BCC)</w:t>
+        </w:rPr>
+      </w:pPr>
+      <w:r>
+        <w:rPr>
+          <w:rFonts w:ascii="Aptos" w:hAnsi="Aptos"/>
+          <w:b/>
+          <w:bCs/>
+        </w:rPr>
+        <w:t>Dashboard / Visualization:</w:t>
+      </w:r>
+      <w:r>
+        <w:rPr>
+          <w:rFonts w:ascii="Aptos" w:hAnsi="Aptos"/>
+        </w:rPr>
+        <w:t xml:space="preserve"> Power BI for interactive analytics and visualizations.</w:t>
       </w:r>
     </w:p>
     <w:p>
       <w:pPr>
+        <w:numPr>
+          <w:ilvl w:val="0"/>
+          <w:numId w:val="21"/>
+        </w:numPr>
+        <w:spacing w:line="259" w:lineRule="auto"/>
+        <w:rPr>
+          <w:rFonts w:ascii="Aptos" w:hAnsi="Aptos"/>
+          <w:b/>
+          <w:bCs/>
+        </w:rPr>
+      </w:pPr>
+      <w:r>
+        <w:rPr>
+          <w:rFonts w:ascii="Aptos" w:hAnsi="Aptos"/>
+          <w:b/>
+          <w:bCs/>
+        </w:rPr>
+        <w:t>Business Customer Connect (BCC)</w:t>
+      </w:r>
+    </w:p>
+    <w:p>
+      <w:pPr>
         <w:ind w:left="1080"/>
         <w:rPr>
           <w:rFonts w:ascii="Aptos" w:hAnsi="Aptos"/>
@@ -7375,6 +7271,7 @@
         <w:rPr>
           <w:rFonts w:ascii="Aptos" w:hAnsi="Aptos"/>
         </w:rPr>
+        <w:lastRenderedPageBreak/>
         <w:t>BCC is a USPS program that streamlines mailings by ensuring:</w:t>
       </w:r>
     </w:p>
@@ -7395,7 +7292,6 @@
           <w:b/>
           <w:bCs/>
         </w:rPr>
-        <w:lastRenderedPageBreak/>
         <w:t>USPS Regulations</w:t>
       </w:r>
       <w:r>
@@ -7974,7 +7870,6 @@
           <w:b/>
           <w:bCs/>
         </w:rPr>
-        <w:lastRenderedPageBreak/>
         <w:t>6</w:t>
       </w:r>
       <w:r>
@@ -8223,7 +8118,6 @@
                 <w:bCs/>
               </w:rPr>
             </w:pPr>
-            <w:proofErr w:type="spellStart"/>
             <w:r>
               <w:rPr>
                 <w:rFonts w:ascii="Aptos" w:hAnsi="Aptos"/>
@@ -8232,7 +8126,6 @@
               </w:rPr>
               <w:t>Jobs_Panels</w:t>
             </w:r>
-            <w:proofErr w:type="spellEnd"/>
           </w:p>
         </w:tc>
         <w:tc>
@@ -8336,7 +8229,6 @@
                 <w:bCs/>
               </w:rPr>
             </w:pPr>
-            <w:proofErr w:type="spellStart"/>
             <w:r>
               <w:rPr>
                 <w:rFonts w:ascii="Aptos" w:hAnsi="Aptos"/>
@@ -8345,7 +8237,6 @@
               </w:rPr>
               <w:t>Aggregation_Log</w:t>
             </w:r>
-            <w:proofErr w:type="spellEnd"/>
           </w:p>
         </w:tc>
         <w:tc>
@@ -8639,7 +8530,6 @@
         </w:rPr>
         <w:t xml:space="preserve">available in </w:t>
       </w:r>
-      <w:proofErr w:type="spellStart"/>
       <w:r>
         <w:rPr>
           <w:rFonts w:ascii="Aptos" w:hAnsi="Aptos"/>
@@ -8656,7 +8546,6 @@
         </w:rPr>
         <w:t>.sql</w:t>
       </w:r>
-      <w:proofErr w:type="spellEnd"/>
       <w:r>
         <w:rPr>
           <w:rFonts w:ascii="Aptos" w:hAnsi="Aptos"/>
@@ -8794,7 +8683,6 @@
         </w:rPr>
         <w:t xml:space="preserve"> </w:t>
       </w:r>
-      <w:proofErr w:type="spellStart"/>
       <w:r>
         <w:rPr>
           <w:rFonts w:ascii="Aptos" w:hAnsi="Aptos"/>
@@ -8811,7 +8699,6 @@
         </w:rPr>
         <w:t>.sql</w:t>
       </w:r>
-      <w:proofErr w:type="spellEnd"/>
       <w:r>
         <w:rPr>
           <w:rFonts w:ascii="Aptos" w:hAnsi="Aptos"/>
@@ -9024,6 +8911,7 @@
           <w:sz w:val="26"/>
           <w:szCs w:val="26"/>
         </w:rPr>
+        <w:lastRenderedPageBreak/>
         <w:t>Expected Outcomes</w:t>
       </w:r>
     </w:p>
@@ -9042,7 +8930,6 @@
         <w:rPr>
           <w:rFonts w:ascii="Aptos" w:hAnsi="Aptos"/>
         </w:rPr>
-        <w:lastRenderedPageBreak/>
         <w:t>A fully automated ETL pipeline integrating panel and donor data into SQL Server tables.</w:t>
       </w:r>
     </w:p>

</xml_diff>